<commit_message>
fix: corregir edad de YP (38 anos, confirmada con documento oficial)
Actualiza la edad en config.json, README y documentos del protocolo tras
verificar con certificacion oficial de discapacidad. Se agrega nota de
que existe caracterizacion clinica formal, mantenida confidencial en
docs/CONFIDENCIAL-caracterizacion-clinica.md (excluido de git) por
sensibilidad de datos de salud -- resuelve la limitacion de "sin
caracterizacion clinica formal" sin exponer diagnostico especifico.
</commit_message>
<xml_diff>
--- a/docs/Protocolo_Investigacion_MVP_Voz_Gestos.docx
+++ b/docs/Protocolo_Investigacion_MVP_Voz_Gestos.docx
@@ -728,7 +728,7 @@
                 <w:sz w:val="20"/>
                 <w:szCs w:val="20"/>
               </w:rPr>
-              <w:t xml:space="preserve">35 años</w:t>
+              <w:t xml:space="preserve">38 años</w:t>
             </w:r>
           </w:p>
         </w:tc>
@@ -798,7 +798,7 @@
                 <w:sz w:val="20"/>
                 <w:szCs w:val="20"/>
               </w:rPr>
-              <w:t xml:space="preserve">Desconexión motora del habla (apraxia/disartria a caracterizar clínicamente); reconoce sonidos e imágenes</w:t>
+              <w:t xml:space="preserve">Condición neuromotora congénita con compromiso del habla y motor; reconoce sonidos e imágenes. Cuenta con certificación oficial de discapacidad y caracterización clínica formal (Ministerio de Salud); diagnóstico específico mantenido en anexo confidencial no publicado, por sensibilidad de datos de salud</w:t>
             </w:r>
           </w:p>
         </w:tc>
@@ -5741,7 +5741,7 @@
       <w:pPr>
         <w:spacing w:after="100"/>
       </w:pPr>
-      <w:hyperlink w:history="1" r:id="rIdz5oekpd6ih8cigt86knb8">
+      <w:hyperlink w:history="1" r:id="rIdzspcz7gakjoj-tfc1sp_g">
         <w:r>
           <w:rPr>
             <w:rStyle w:val="Hyperlink"/>
@@ -5754,7 +5754,7 @@
       <w:pPr>
         <w:spacing w:after="100"/>
       </w:pPr>
-      <w:hyperlink w:history="1" r:id="rId22ekahdtd_dnt3wxsqesr">
+      <w:hyperlink w:history="1" r:id="rId-ntla95uflvqf9aqkamiv">
         <w:r>
           <w:rPr>
             <w:rStyle w:val="Hyperlink"/>
@@ -5767,7 +5767,7 @@
       <w:pPr>
         <w:spacing w:after="100"/>
       </w:pPr>
-      <w:hyperlink w:history="1" r:id="rIdmajriw3_qkwneh0er2eij">
+      <w:hyperlink w:history="1" r:id="rId-3cjgl-kaf7ciiputlixe">
         <w:r>
           <w:rPr>
             <w:rStyle w:val="Hyperlink"/>
@@ -5780,7 +5780,7 @@
       <w:pPr>
         <w:spacing w:after="100"/>
       </w:pPr>
-      <w:hyperlink w:history="1" r:id="rIdhx0em0naxmfrceq455a3x">
+      <w:hyperlink w:history="1" r:id="rIdfru7usxka73clykzzt4xb">
         <w:r>
           <w:rPr>
             <w:rStyle w:val="Hyperlink"/>
@@ -5793,7 +5793,7 @@
       <w:pPr>
         <w:spacing w:after="100"/>
       </w:pPr>
-      <w:hyperlink w:history="1" r:id="rIdrfkqz9vaj8eqjhibpwape">
+      <w:hyperlink w:history="1" r:id="rIdtkknk7r8lrae-m74hjdg-">
         <w:r>
           <w:rPr>
             <w:rStyle w:val="Hyperlink"/>
@@ -5806,7 +5806,7 @@
       <w:pPr>
         <w:spacing w:after="100"/>
       </w:pPr>
-      <w:hyperlink w:history="1" r:id="rIdfk7_2gstmlbflvnz-hfd9">
+      <w:hyperlink w:history="1" r:id="rIdjnioibipvn2a4yhxjpkpk">
         <w:r>
           <w:rPr>
             <w:rStyle w:val="Hyperlink"/>
@@ -5819,7 +5819,7 @@
       <w:pPr>
         <w:spacing w:after="100"/>
       </w:pPr>
-      <w:hyperlink w:history="1" r:id="rIdw7av_pnlh_m8cpg-ojzz0">
+      <w:hyperlink w:history="1" r:id="rIdww2uhqn7-1skgbm0mgdne">
         <w:r>
           <w:rPr>
             <w:rStyle w:val="Hyperlink"/>
@@ -5832,7 +5832,7 @@
       <w:pPr>
         <w:spacing w:after="100"/>
       </w:pPr>
-      <w:hyperlink w:history="1" r:id="rIdvjl6hyw1suhvlgdizktss">
+      <w:hyperlink w:history="1" r:id="rIdz2yjw5pm2h40j2frztsde">
         <w:r>
           <w:rPr>
             <w:rStyle w:val="Hyperlink"/>

</xml_diff>

<commit_message>
feat: adaptar protocolo al procedimiento exacto del comite de etica CUC
Incorpora el Acuerdo 1231/2018 (Consejo Directivo, Universidad de la
Costa CUC) que crea y reglamenta el Comite de Etica institucional:

- Clasificacion de riesgo propuesta (investigacion con riesgo minimo,
  Art. 22 del acuerdo / Resolucion 8430 Art. 9-11) con justificacion.
- Checklist exacto de los 6 documentos exigidos por el Articulo 13,
  con el estado actual de cada uno.
- Procedimiento y plazos reales: radicacion 15 dias habiles antes de
  sesion ordinaria (ultimo martes del mes); proxima sesion viable
  25-ago-2026, radicar antes del 4-ago-2026.
- Nota sobre el experto tecnico en discapacidad que el Art. 6.4 ya
  contempla para este tipo de investigacion.
- Autor y universidad completados en portada del Word y articulo.
</commit_message>
<xml_diff>
--- a/docs/Protocolo_Investigacion_MVP_Voz_Gestos.docx
+++ b/docs/Protocolo_Investigacion_MVP_Voz_Gestos.docx
@@ -78,7 +78,7 @@
           <w:sz w:val="22"/>
           <w:szCs w:val="22"/>
         </w:rPr>
-        <w:t xml:space="preserve">[Nombre del investigador principal — completar]</w:t>
+        <w:t xml:space="preserve">Wilmer José Pérez Orozco</w:t>
       </w:r>
     </w:p>
     <w:p>
@@ -102,7 +102,7 @@
           <w:sz w:val="22"/>
           <w:szCs w:val="22"/>
         </w:rPr>
-        <w:t xml:space="preserve">[Universidad — completar]</w:t>
+        <w:t xml:space="preserve">Corporación Universidad de la Costa, CUC</w:t>
       </w:r>
     </w:p>
     <w:p>
@@ -4435,7 +4435,20 @@
         <w:spacing w:after="100"/>
       </w:pPr>
       <w:r>
-        <w:t xml:space="preserve">Resolución 8430 de 1993 (Ministerio de Salud — normas científicas, técnicas y administrativas para la investigación en salud): norma de referencia para la evaluación del protocolo por parte del comité de ética institucional, incluyendo la clasificación del nivel de riesgo de la investigación y la validación del proceso de consentimiento informado.</w:t>
+        <w:t xml:space="preserve">Resolución 8430 de 1993 (Ministerio de Salud — normas científicas, técnicas y administrativas para la investigación en salud): norma de referencia nacional para la clasificación del riesgo de la investigación y el consentimiento informado.</w:t>
+      </w:r>
+    </w:p>
+    <w:p>
+      <w:pPr>
+        <w:pStyle w:val="ListParagraph"/>
+        <w:numPr>
+          <w:ilvl w:val="0"/>
+          <w:numId w:val="2"/>
+        </w:numPr>
+        <w:spacing w:after="100"/>
+      </w:pPr>
+      <w:r>
+        <w:t xml:space="preserve">Acuerdo 1231 del 29 de agosto de 2018 (Consejo Directivo, Corporación Universidad de la Costa CUC): crea y reglamenta el Comité de Ética, Bioética e Integridad Científica Institucional, adscrito a la Vicerrectoría de Investigación — norma institucional específica que rige este protocolo.</w:t>
       </w:r>
     </w:p>
     <w:p>
@@ -4451,7 +4464,7 @@
         <w:spacing w:after="160"/>
       </w:pPr>
       <w:r>
-        <w:t xml:space="preserve">Se cuenta con consentimiento informado firmado por la participante actual (o su representante, según corresponda) antes de cualquier grabación, incluyendo: propósito del estudio, naturaleza de los datos recolectados, alcance de la publicación (solo alias y métricas agregadas), derecho a retirarse en cualquier momento y a solicitar la eliminación de sus datos. Un modelo de consentimiento para voluntarios adicionales se incluye en el anexo A.</w:t>
+        <w:t xml:space="preserve">Se cuenta con consentimiento informado firmado por la participante actual (o su representante, según corresponda) antes de cualquier grabación, incluyendo: propósito del estudio, naturaleza de los datos recolectados, alcance de la publicación (solo alias y métricas agregadas), derecho a retirarse en cualquier momento y a solicitar la eliminación de sus datos. Un modelo de consentimiento para voluntarios adicionales se incluye en el anexo A, con fecha de elaboración y número de versión conforme exige el Artículo 13.4 del Acuerdo 1231/2018.</w:t>
       </w:r>
     </w:p>
     <w:p>
@@ -4459,7 +4472,7 @@
         <w:pStyle w:val="Heading2"/>
       </w:pPr>
       <w:r>
-        <w:t xml:space="preserve">9.3 Solicitud al comité de ética</w:t>
+        <w:t xml:space="preserve">9.3 Clasificación de riesgo propuesta (Artículo 22, Acuerdo 1231/2018 — Resolución 8430/1993, Arts. 9-11)</w:t>
       </w:r>
     </w:p>
     <w:p>
@@ -4467,7 +4480,549 @@
         <w:spacing w:after="160"/>
       </w:pPr>
       <w:r>
-        <w:t xml:space="preserve">Se solicita formalmente al comité de ética institucional: (a) la evaluación y clasificación del riesgo de la investigación conforme a la Resolución 8430 de 1993; (b) la revisión y aval del proceso e instrumento de consentimiento informado, tanto el ya utilizado como el propuesto para voluntarios adicionales; y (c) el aval institucional necesario para la ampliación de la muestra y para la eventual publicación en una revista científica indexada.</w:t>
+        <w:t xml:space="preserve">Se propone clasificar este estudio como INVESTIGACIÓN CON RIESGO MÍNIMO: es un estudio prospectivo de registro de datos mediante procedimientos comunes (grabación de voz y video de movimientos en respuesta a estímulos visuales), sin manipulación de la conducta de la participante y sin ningún procedimiento invasivo, farmacológico o quirúrgico — categoría explícitamente contemplada en el Artículo 22 del Acuerdo 1231/2018 ("pruebas sicológicas a grupos o individuos en los que no se manipulará la conducta del sujeto"). La clasificación definitiva corresponde al Comité de Ética y a su experto técnico designado.</w:t>
+      </w:r>
+    </w:p>
+    <w:p>
+      <w:pPr>
+        <w:pStyle w:val="Heading2"/>
+      </w:pPr>
+      <w:r>
+        <w:t xml:space="preserve">9.4 Procedimiento de solicitud ante el Comité de Ética de la CUC</w:t>
+      </w:r>
+    </w:p>
+    <w:p>
+      <w:pPr>
+        <w:spacing w:after="160"/>
+      </w:pPr>
+      <w:r>
+        <w:t xml:space="preserve">Conforme al Acuerdo 1231/2018, la solicitud debe radicarse por correo institucional mediante el formulario dispuesto por la Secretaría Jurídica, con mínimo quince (15) días hábiles de antelación a la sesión ordinaria (última fecha viable: sesión del 25 de agosto de 2026, radicación antes del 4 de agosto de 2026 — verificar con la Secretaría Jurídica por posibles festivos). El Comité sesiona el último martes de cada mes (excepto diciembre).</w:t>
+      </w:r>
+    </w:p>
+    <w:p>
+      <w:pPr>
+        <w:spacing w:after="160"/>
+      </w:pPr>
+      <w:r>
+        <w:t xml:space="preserve">Documentos exigidos por el Artículo 13 y su estado actual en este proyecto:</w:t>
+      </w:r>
+    </w:p>
+    <w:tbl>
+      <w:tblPr>
+        <w:tblW w:type="dxa" w:w="9360"/>
+        <w:tblBorders>
+          <w:top w:val="single" w:color="auto" w:sz="4"/>
+          <w:left w:val="single" w:color="auto" w:sz="4"/>
+          <w:bottom w:val="single" w:color="auto" w:sz="4"/>
+          <w:right w:val="single" w:color="auto" w:sz="4"/>
+          <w:insideH w:val="single" w:color="auto" w:sz="4"/>
+          <w:insideV w:val="single" w:color="auto" w:sz="4"/>
+        </w:tblBorders>
+      </w:tblPr>
+      <w:tblGrid>
+        <w:gridCol w:w="5360"/>
+        <w:gridCol w:w="4000"/>
+      </w:tblGrid>
+      <w:tr>
+        <w:trPr>
+          <w:tblHeader/>
+        </w:trPr>
+        <w:tc>
+          <w:tcPr>
+            <w:tcW w:type="dxa" w:w="5360"/>
+            <w:tcBorders>
+              <w:top w:val="single" w:color="BFBFBF" w:sz="4"/>
+              <w:left w:val="single" w:color="BFBFBF" w:sz="4"/>
+              <w:bottom w:val="single" w:color="BFBFBF" w:sz="4"/>
+              <w:right w:val="single" w:color="BFBFBF" w:sz="4"/>
+            </w:tcBorders>
+            <w:shd w:fill="1F4E79" w:val="clear"/>
+            <w:tcMar>
+              <w:top w:type="dxa" w:w="80"/>
+              <w:left w:type="dxa" w:w="120"/>
+              <w:bottom w:type="dxa" w:w="80"/>
+              <w:right w:type="dxa" w:w="120"/>
+            </w:tcMar>
+            <w:vAlign w:val="center"/>
+          </w:tcPr>
+          <w:p>
+            <w:pPr>
+              <w:jc w:val="left"/>
+            </w:pPr>
+            <w:r>
+              <w:rPr>
+                <w:b/>
+                <w:bCs/>
+                <w:color w:val="FFFFFF"/>
+                <w:sz w:val="20"/>
+                <w:szCs w:val="20"/>
+              </w:rPr>
+              <w:t xml:space="preserve">Documento exigido (Art. 13)</w:t>
+            </w:r>
+          </w:p>
+        </w:tc>
+        <w:tc>
+          <w:tcPr>
+            <w:tcW w:type="dxa" w:w="4000"/>
+            <w:tcBorders>
+              <w:top w:val="single" w:color="BFBFBF" w:sz="4"/>
+              <w:left w:val="single" w:color="BFBFBF" w:sz="4"/>
+              <w:bottom w:val="single" w:color="BFBFBF" w:sz="4"/>
+              <w:right w:val="single" w:color="BFBFBF" w:sz="4"/>
+            </w:tcBorders>
+            <w:shd w:fill="1F4E79" w:val="clear"/>
+            <w:tcMar>
+              <w:top w:type="dxa" w:w="80"/>
+              <w:left w:type="dxa" w:w="120"/>
+              <w:bottom w:type="dxa" w:w="80"/>
+              <w:right w:type="dxa" w:w="120"/>
+            </w:tcMar>
+            <w:vAlign w:val="center"/>
+          </w:tcPr>
+          <w:p>
+            <w:pPr>
+              <w:jc w:val="left"/>
+            </w:pPr>
+            <w:r>
+              <w:rPr>
+                <w:b/>
+                <w:bCs/>
+                <w:color w:val="FFFFFF"/>
+                <w:sz w:val="20"/>
+                <w:szCs w:val="20"/>
+              </w:rPr>
+              <w:t xml:space="preserve">Estado</w:t>
+            </w:r>
+          </w:p>
+        </w:tc>
+      </w:tr>
+      <w:tr>
+        <w:tc>
+          <w:tcPr>
+            <w:tcW w:type="dxa" w:w="5360"/>
+            <w:tcBorders>
+              <w:top w:val="single" w:color="BFBFBF" w:sz="4"/>
+              <w:left w:val="single" w:color="BFBFBF" w:sz="4"/>
+              <w:bottom w:val="single" w:color="BFBFBF" w:sz="4"/>
+              <w:right w:val="single" w:color="BFBFBF" w:sz="4"/>
+            </w:tcBorders>
+            <w:shd w:fill="FFFFFF" w:val="clear"/>
+            <w:tcMar>
+              <w:top w:type="dxa" w:w="80"/>
+              <w:left w:type="dxa" w:w="120"/>
+              <w:bottom w:type="dxa" w:w="80"/>
+              <w:right w:type="dxa" w:w="120"/>
+            </w:tcMar>
+            <w:vAlign w:val="center"/>
+          </w:tcPr>
+          <w:p>
+            <w:pPr>
+              <w:jc w:val="left"/>
+            </w:pPr>
+            <w:r>
+              <w:rPr>
+                <w:b w:val="false"/>
+                <w:bCs w:val="false"/>
+                <w:color w:val="000000"/>
+                <w:sz w:val="20"/>
+                <w:szCs w:val="20"/>
+              </w:rPr>
+              <w:t xml:space="preserve">1. Cuerpo del proyecto completo</w:t>
+            </w:r>
+          </w:p>
+        </w:tc>
+        <w:tc>
+          <w:tcPr>
+            <w:tcW w:type="dxa" w:w="4000"/>
+            <w:tcBorders>
+              <w:top w:val="single" w:color="BFBFBF" w:sz="4"/>
+              <w:left w:val="single" w:color="BFBFBF" w:sz="4"/>
+              <w:bottom w:val="single" w:color="BFBFBF" w:sz="4"/>
+              <w:right w:val="single" w:color="BFBFBF" w:sz="4"/>
+            </w:tcBorders>
+            <w:shd w:fill="FFFFFF" w:val="clear"/>
+            <w:tcMar>
+              <w:top w:type="dxa" w:w="80"/>
+              <w:left w:type="dxa" w:w="120"/>
+              <w:bottom w:type="dxa" w:w="80"/>
+              <w:right w:type="dxa" w:w="120"/>
+            </w:tcMar>
+            <w:vAlign w:val="center"/>
+          </w:tcPr>
+          <w:p>
+            <w:pPr>
+              <w:jc w:val="left"/>
+            </w:pPr>
+            <w:r>
+              <w:rPr>
+                <w:b w:val="false"/>
+                <w:bCs w:val="false"/>
+                <w:color w:val="000000"/>
+                <w:sz w:val="20"/>
+                <w:szCs w:val="20"/>
+              </w:rPr>
+              <w:t xml:space="preserve">Listo — este documento</w:t>
+            </w:r>
+          </w:p>
+        </w:tc>
+      </w:tr>
+      <w:tr>
+        <w:tc>
+          <w:tcPr>
+            <w:tcW w:type="dxa" w:w="5360"/>
+            <w:tcBorders>
+              <w:top w:val="single" w:color="BFBFBF" w:sz="4"/>
+              <w:left w:val="single" w:color="BFBFBF" w:sz="4"/>
+              <w:bottom w:val="single" w:color="BFBFBF" w:sz="4"/>
+              <w:right w:val="single" w:color="BFBFBF" w:sz="4"/>
+            </w:tcBorders>
+            <w:shd w:fill="FFFFFF" w:val="clear"/>
+            <w:tcMar>
+              <w:top w:type="dxa" w:w="80"/>
+              <w:left w:type="dxa" w:w="120"/>
+              <w:bottom w:type="dxa" w:w="80"/>
+              <w:right w:type="dxa" w:w="120"/>
+            </w:tcMar>
+            <w:vAlign w:val="center"/>
+          </w:tcPr>
+          <w:p>
+            <w:pPr>
+              <w:jc w:val="left"/>
+            </w:pPr>
+            <w:r>
+              <w:rPr>
+                <w:b w:val="false"/>
+                <w:bCs w:val="false"/>
+                <w:color w:val="000000"/>
+                <w:sz w:val="20"/>
+                <w:szCs w:val="20"/>
+              </w:rPr>
+              <w:t xml:space="preserve">2. Estrategias de reclutamiento de sujetos</w:t>
+            </w:r>
+          </w:p>
+        </w:tc>
+        <w:tc>
+          <w:tcPr>
+            <w:tcW w:type="dxa" w:w="4000"/>
+            <w:tcBorders>
+              <w:top w:val="single" w:color="BFBFBF" w:sz="4"/>
+              <w:left w:val="single" w:color="BFBFBF" w:sz="4"/>
+              <w:bottom w:val="single" w:color="BFBFBF" w:sz="4"/>
+              <w:right w:val="single" w:color="BFBFBF" w:sz="4"/>
+            </w:tcBorders>
+            <w:shd w:fill="FFFFFF" w:val="clear"/>
+            <w:tcMar>
+              <w:top w:type="dxa" w:w="80"/>
+              <w:left w:type="dxa" w:w="120"/>
+              <w:bottom w:type="dxa" w:w="80"/>
+              <w:right w:type="dxa" w:w="120"/>
+            </w:tcMar>
+            <w:vAlign w:val="center"/>
+          </w:tcPr>
+          <w:p>
+            <w:pPr>
+              <w:jc w:val="left"/>
+            </w:pPr>
+            <w:r>
+              <w:rPr>
+                <w:b w:val="false"/>
+                <w:bCs w:val="false"/>
+                <w:color w:val="000000"/>
+                <w:sz w:val="20"/>
+                <w:szCs w:val="20"/>
+              </w:rPr>
+              <w:t xml:space="preserve">Listo — sección 10</w:t>
+            </w:r>
+          </w:p>
+        </w:tc>
+      </w:tr>
+      <w:tr>
+        <w:tc>
+          <w:tcPr>
+            <w:tcW w:type="dxa" w:w="5360"/>
+            <w:tcBorders>
+              <w:top w:val="single" w:color="BFBFBF" w:sz="4"/>
+              <w:left w:val="single" w:color="BFBFBF" w:sz="4"/>
+              <w:bottom w:val="single" w:color="BFBFBF" w:sz="4"/>
+              <w:right w:val="single" w:color="BFBFBF" w:sz="4"/>
+            </w:tcBorders>
+            <w:shd w:fill="FFFFFF" w:val="clear"/>
+            <w:tcMar>
+              <w:top w:type="dxa" w:w="80"/>
+              <w:left w:type="dxa" w:w="120"/>
+              <w:bottom w:type="dxa" w:w="80"/>
+              <w:right w:type="dxa" w:w="120"/>
+            </w:tcMar>
+            <w:vAlign w:val="center"/>
+          </w:tcPr>
+          <w:p>
+            <w:pPr>
+              <w:jc w:val="left"/>
+            </w:pPr>
+            <w:r>
+              <w:rPr>
+                <w:b w:val="false"/>
+                <w:bCs w:val="false"/>
+                <w:color w:val="000000"/>
+                <w:sz w:val="20"/>
+                <w:szCs w:val="20"/>
+              </w:rPr>
+              <w:t xml:space="preserve">3. Copia de encuestas/folletos/tests a realizar</w:t>
+            </w:r>
+          </w:p>
+        </w:tc>
+        <w:tc>
+          <w:tcPr>
+            <w:tcW w:type="dxa" w:w="4000"/>
+            <w:tcBorders>
+              <w:top w:val="single" w:color="BFBFBF" w:sz="4"/>
+              <w:left w:val="single" w:color="BFBFBF" w:sz="4"/>
+              <w:bottom w:val="single" w:color="BFBFBF" w:sz="4"/>
+              <w:right w:val="single" w:color="BFBFBF" w:sz="4"/>
+            </w:tcBorders>
+            <w:shd w:fill="FFFFFF" w:val="clear"/>
+            <w:tcMar>
+              <w:top w:type="dxa" w:w="80"/>
+              <w:left w:type="dxa" w:w="120"/>
+              <w:bottom w:type="dxa" w:w="80"/>
+              <w:right w:type="dxa" w:w="120"/>
+            </w:tcMar>
+            <w:vAlign w:val="center"/>
+          </w:tcPr>
+          <w:p>
+            <w:pPr>
+              <w:jc w:val="left"/>
+            </w:pPr>
+            <w:r>
+              <w:rPr>
+                <w:b w:val="false"/>
+                <w:bCs w:val="false"/>
+                <w:color w:val="000000"/>
+                <w:sz w:val="20"/>
+                <w:szCs w:val="20"/>
+              </w:rPr>
+              <w:t xml:space="preserve">Listo — vocabulario y protocolo de captura, secciones 5.4 y anexo B</w:t>
+            </w:r>
+          </w:p>
+        </w:tc>
+      </w:tr>
+      <w:tr>
+        <w:tc>
+          <w:tcPr>
+            <w:tcW w:type="dxa" w:w="5360"/>
+            <w:tcBorders>
+              <w:top w:val="single" w:color="BFBFBF" w:sz="4"/>
+              <w:left w:val="single" w:color="BFBFBF" w:sz="4"/>
+              <w:bottom w:val="single" w:color="BFBFBF" w:sz="4"/>
+              <w:right w:val="single" w:color="BFBFBF" w:sz="4"/>
+            </w:tcBorders>
+            <w:shd w:fill="FFFFFF" w:val="clear"/>
+            <w:tcMar>
+              <w:top w:type="dxa" w:w="80"/>
+              <w:left w:type="dxa" w:w="120"/>
+              <w:bottom w:type="dxa" w:w="80"/>
+              <w:right w:type="dxa" w:w="120"/>
+            </w:tcMar>
+            <w:vAlign w:val="center"/>
+          </w:tcPr>
+          <w:p>
+            <w:pPr>
+              <w:jc w:val="left"/>
+            </w:pPr>
+            <w:r>
+              <w:rPr>
+                <w:b w:val="false"/>
+                <w:bCs w:val="false"/>
+                <w:color w:val="000000"/>
+                <w:sz w:val="20"/>
+                <w:szCs w:val="20"/>
+              </w:rPr>
+              <w:t xml:space="preserve">4. Consentimiento informado (con fecha y versión)</w:t>
+            </w:r>
+          </w:p>
+        </w:tc>
+        <w:tc>
+          <w:tcPr>
+            <w:tcW w:type="dxa" w:w="4000"/>
+            <w:tcBorders>
+              <w:top w:val="single" w:color="BFBFBF" w:sz="4"/>
+              <w:left w:val="single" w:color="BFBFBF" w:sz="4"/>
+              <w:bottom w:val="single" w:color="BFBFBF" w:sz="4"/>
+              <w:right w:val="single" w:color="BFBFBF" w:sz="4"/>
+            </w:tcBorders>
+            <w:shd w:fill="FFFFFF" w:val="clear"/>
+            <w:tcMar>
+              <w:top w:type="dxa" w:w="80"/>
+              <w:left w:type="dxa" w:w="120"/>
+              <w:bottom w:type="dxa" w:w="80"/>
+              <w:right w:type="dxa" w:w="120"/>
+            </w:tcMar>
+            <w:vAlign w:val="center"/>
+          </w:tcPr>
+          <w:p>
+            <w:pPr>
+              <w:jc w:val="left"/>
+            </w:pPr>
+            <w:r>
+              <w:rPr>
+                <w:b w:val="false"/>
+                <w:bCs w:val="false"/>
+                <w:color w:val="000000"/>
+                <w:sz w:val="20"/>
+                <w:szCs w:val="20"/>
+              </w:rPr>
+              <w:t xml:space="preserve">Plantilla lista (anexo A) — falta fecha y versión definitivas</w:t>
+            </w:r>
+          </w:p>
+        </w:tc>
+      </w:tr>
+      <w:tr>
+        <w:tc>
+          <w:tcPr>
+            <w:tcW w:type="dxa" w:w="5360"/>
+            <w:tcBorders>
+              <w:top w:val="single" w:color="BFBFBF" w:sz="4"/>
+              <w:left w:val="single" w:color="BFBFBF" w:sz="4"/>
+              <w:bottom w:val="single" w:color="BFBFBF" w:sz="4"/>
+              <w:right w:val="single" w:color="BFBFBF" w:sz="4"/>
+            </w:tcBorders>
+            <w:shd w:fill="FFFFFF" w:val="clear"/>
+            <w:tcMar>
+              <w:top w:type="dxa" w:w="80"/>
+              <w:left w:type="dxa" w:w="120"/>
+              <w:bottom w:type="dxa" w:w="80"/>
+              <w:right w:type="dxa" w:w="120"/>
+            </w:tcMar>
+            <w:vAlign w:val="center"/>
+          </w:tcPr>
+          <w:p>
+            <w:pPr>
+              <w:jc w:val="left"/>
+            </w:pPr>
+            <w:r>
+              <w:rPr>
+                <w:b w:val="false"/>
+                <w:bCs w:val="false"/>
+                <w:color w:val="000000"/>
+                <w:sz w:val="20"/>
+                <w:szCs w:val="20"/>
+              </w:rPr>
+              <w:t xml:space="preserve">5. Autorizaciones/permisos de autoridad competente</w:t>
+            </w:r>
+          </w:p>
+        </w:tc>
+        <w:tc>
+          <w:tcPr>
+            <w:tcW w:type="dxa" w:w="4000"/>
+            <w:tcBorders>
+              <w:top w:val="single" w:color="BFBFBF" w:sz="4"/>
+              <w:left w:val="single" w:color="BFBFBF" w:sz="4"/>
+              <w:bottom w:val="single" w:color="BFBFBF" w:sz="4"/>
+              <w:right w:val="single" w:color="BFBFBF" w:sz="4"/>
+            </w:tcBorders>
+            <w:shd w:fill="FFFFFF" w:val="clear"/>
+            <w:tcMar>
+              <w:top w:type="dxa" w:w="80"/>
+              <w:left w:type="dxa" w:w="120"/>
+              <w:bottom w:type="dxa" w:w="80"/>
+              <w:right w:type="dxa" w:w="120"/>
+            </w:tcMar>
+            <w:vAlign w:val="center"/>
+          </w:tcPr>
+          <w:p>
+            <w:pPr>
+              <w:jc w:val="left"/>
+            </w:pPr>
+            <w:r>
+              <w:rPr>
+                <w:b w:val="false"/>
+                <w:bCs w:val="false"/>
+                <w:color w:val="000000"/>
+                <w:sz w:val="20"/>
+                <w:szCs w:val="20"/>
+              </w:rPr>
+              <w:t xml:space="preserve">No aplica (sin dispositivo médico registrado ni intervención regulada)</w:t>
+            </w:r>
+          </w:p>
+        </w:tc>
+      </w:tr>
+      <w:tr>
+        <w:tc>
+          <w:tcPr>
+            <w:tcW w:type="dxa" w:w="5360"/>
+            <w:tcBorders>
+              <w:top w:val="single" w:color="BFBFBF" w:sz="4"/>
+              <w:left w:val="single" w:color="BFBFBF" w:sz="4"/>
+              <w:bottom w:val="single" w:color="BFBFBF" w:sz="4"/>
+              <w:right w:val="single" w:color="BFBFBF" w:sz="4"/>
+            </w:tcBorders>
+            <w:shd w:fill="FFFFFF" w:val="clear"/>
+            <w:tcMar>
+              <w:top w:type="dxa" w:w="80"/>
+              <w:left w:type="dxa" w:w="120"/>
+              <w:bottom w:type="dxa" w:w="80"/>
+              <w:right w:type="dxa" w:w="120"/>
+            </w:tcMar>
+            <w:vAlign w:val="center"/>
+          </w:tcPr>
+          <w:p>
+            <w:pPr>
+              <w:jc w:val="left"/>
+            </w:pPr>
+            <w:r>
+              <w:rPr>
+                <w:b w:val="false"/>
+                <w:bCs w:val="false"/>
+                <w:color w:val="000000"/>
+                <w:sz w:val="20"/>
+                <w:szCs w:val="20"/>
+              </w:rPr>
+              <w:t xml:space="preserve">6. Hoja de vida del investigador principal y coinvestigadores</w:t>
+            </w:r>
+          </w:p>
+        </w:tc>
+        <w:tc>
+          <w:tcPr>
+            <w:tcW w:type="dxa" w:w="4000"/>
+            <w:tcBorders>
+              <w:top w:val="single" w:color="BFBFBF" w:sz="4"/>
+              <w:left w:val="single" w:color="BFBFBF" w:sz="4"/>
+              <w:bottom w:val="single" w:color="BFBFBF" w:sz="4"/>
+              <w:right w:val="single" w:color="BFBFBF" w:sz="4"/>
+            </w:tcBorders>
+            <w:shd w:fill="FFFFFF" w:val="clear"/>
+            <w:tcMar>
+              <w:top w:type="dxa" w:w="80"/>
+              <w:left w:type="dxa" w:w="120"/>
+              <w:bottom w:type="dxa" w:w="80"/>
+              <w:right w:type="dxa" w:w="120"/>
+            </w:tcMar>
+            <w:vAlign w:val="center"/>
+          </w:tcPr>
+          <w:p>
+            <w:pPr>
+              <w:jc w:val="left"/>
+            </w:pPr>
+            <w:r>
+              <w:rPr>
+                <w:b w:val="false"/>
+                <w:bCs w:val="false"/>
+                <w:color w:val="000000"/>
+                <w:sz w:val="20"/>
+                <w:szCs w:val="20"/>
+              </w:rPr>
+              <w:t xml:space="preserve">PENDIENTE — falta adjuntar</w:t>
+            </w:r>
+          </w:p>
+        </w:tc>
+      </w:tr>
+    </w:tbl>
+    <w:p>
+      <w:pPr>
+        <w:spacing w:after="160"/>
+      </w:pPr>
+      <w:r>
+        <w:t xml:space="preserve">Nota: el Artículo 6.4 del Acuerdo 1231/2018 contempla explícitamente un experto técnico especializado en "investigación en menores de edad y discapacitados" para casos como este — se recomienda solicitar su participación en la evaluación.</w:t>
       </w:r>
     </w:p>
     <w:p>
@@ -4818,7 +5373,7 @@
                 <w:sz w:val="20"/>
                 <w:szCs w:val="20"/>
               </w:rPr>
-              <w:t xml:space="preserve">Cierre de validación en vivo de la participante actual (voz y fusión secuencial); redacción y sometimiento de este protocolo al comité de ética institucional</w:t>
+              <w:t xml:space="preserve">Cierre de validación en vivo de la participante actual (voz y fusión secuencial); completar hoja de vida e inscripción al nodo regional de RedCOLSI</w:t>
             </w:r>
           </w:p>
         </w:tc>
@@ -4854,7 +5409,7 @@
                 <w:sz w:val="20"/>
                 <w:szCs w:val="20"/>
               </w:rPr>
-              <w:t xml:space="preserve">Agosto 2026</w:t>
+              <w:t xml:space="preserve">Hasta el 4 de agosto de 2026</w:t>
             </w:r>
           </w:p>
         </w:tc>
@@ -4888,7 +5443,7 @@
                 <w:sz w:val="20"/>
                 <w:szCs w:val="20"/>
               </w:rPr>
-              <w:t xml:space="preserve">Respuesta del comité de ética; inicio de reclutamiento de voluntarios; inscripción al nodo regional de RedCOLSI</w:t>
+              <w:t xml:space="preserve">Radicación formal de este protocolo ante la Secretaría Jurídica del Comité de Ética CUC (verificar festivos con la Secretaría)</w:t>
             </w:r>
           </w:p>
         </w:tc>
@@ -4924,6 +5479,76 @@
                 <w:sz w:val="20"/>
                 <w:szCs w:val="20"/>
               </w:rPr>
+              <w:t xml:space="preserve">25 de agosto de 2026</w:t>
+            </w:r>
+          </w:p>
+        </w:tc>
+        <w:tc>
+          <w:tcPr>
+            <w:tcW w:type="dxa" w:w="6860"/>
+            <w:tcBorders>
+              <w:top w:val="single" w:color="BFBFBF" w:sz="4"/>
+              <w:left w:val="single" w:color="BFBFBF" w:sz="4"/>
+              <w:bottom w:val="single" w:color="BFBFBF" w:sz="4"/>
+              <w:right w:val="single" w:color="BFBFBF" w:sz="4"/>
+            </w:tcBorders>
+            <w:shd w:fill="FFFFFF" w:val="clear"/>
+            <w:tcMar>
+              <w:top w:type="dxa" w:w="80"/>
+              <w:left w:type="dxa" w:w="120"/>
+              <w:bottom w:type="dxa" w:w="80"/>
+              <w:right w:type="dxa" w:w="120"/>
+            </w:tcMar>
+            <w:vAlign w:val="center"/>
+          </w:tcPr>
+          <w:p>
+            <w:pPr>
+              <w:jc w:val="left"/>
+            </w:pPr>
+            <w:r>
+              <w:rPr>
+                <w:b w:val="false"/>
+                <w:bCs w:val="false"/>
+                <w:color w:val="000000"/>
+                <w:sz w:val="20"/>
+                <w:szCs w:val="20"/>
+              </w:rPr>
+              <w:t xml:space="preserve">Sesión ordinaria del Comité de Ética (última del mes, salvo convocatoria extraordinaria) — evaluación y decisión sobre el protocolo</w:t>
+            </w:r>
+          </w:p>
+        </w:tc>
+      </w:tr>
+      <w:tr>
+        <w:tc>
+          <w:tcPr>
+            <w:tcW w:type="dxa" w:w="2500"/>
+            <w:tcBorders>
+              <w:top w:val="single" w:color="BFBFBF" w:sz="4"/>
+              <w:left w:val="single" w:color="BFBFBF" w:sz="4"/>
+              <w:bottom w:val="single" w:color="BFBFBF" w:sz="4"/>
+              <w:right w:val="single" w:color="BFBFBF" w:sz="4"/>
+            </w:tcBorders>
+            <w:shd w:fill="FFFFFF" w:val="clear"/>
+            <w:tcMar>
+              <w:top w:type="dxa" w:w="80"/>
+              <w:left w:type="dxa" w:w="120"/>
+              <w:bottom w:type="dxa" w:w="80"/>
+              <w:right w:type="dxa" w:w="120"/>
+            </w:tcMar>
+            <w:vAlign w:val="center"/>
+          </w:tcPr>
+          <w:p>
+            <w:pPr>
+              <w:jc w:val="left"/>
+            </w:pPr>
+            <w:r>
+              <w:rPr>
+                <w:b w:val="false"/>
+                <w:bCs w:val="false"/>
+                <w:color w:val="000000"/>
+                <w:sz w:val="20"/>
+                <w:szCs w:val="20"/>
+              </w:rPr>
               <w:t xml:space="preserve">Septiembre 2026</w:t>
             </w:r>
           </w:p>
@@ -4958,7 +5583,7 @@
                 <w:sz w:val="20"/>
                 <w:szCs w:val="20"/>
               </w:rPr>
-              <w:t xml:space="preserve">Sesiones de grabación con nuevos voluntarios aprobados; participación en encuentro regional RedCOLSI</w:t>
+              <w:t xml:space="preserve">Inicio de reclutamiento de voluntarios (sujeto a aval); sesiones de grabación con nuevos voluntarios aprobados</w:t>
             </w:r>
           </w:p>
         </w:tc>
@@ -5741,7 +6366,7 @@
       <w:pPr>
         <w:spacing w:after="100"/>
       </w:pPr>
-      <w:hyperlink w:history="1" r:id="rIdzspcz7gakjoj-tfc1sp_g">
+      <w:hyperlink w:history="1" r:id="rIdjvjxfhlyhdpdfb06ygtan">
         <w:r>
           <w:rPr>
             <w:rStyle w:val="Hyperlink"/>
@@ -5754,7 +6379,7 @@
       <w:pPr>
         <w:spacing w:after="100"/>
       </w:pPr>
-      <w:hyperlink w:history="1" r:id="rId-ntla95uflvqf9aqkamiv">
+      <w:hyperlink w:history="1" r:id="rIdhkruovm494v6fxe5gprtj">
         <w:r>
           <w:rPr>
             <w:rStyle w:val="Hyperlink"/>
@@ -5767,7 +6392,7 @@
       <w:pPr>
         <w:spacing w:after="100"/>
       </w:pPr>
-      <w:hyperlink w:history="1" r:id="rId-3cjgl-kaf7ciiputlixe">
+      <w:hyperlink w:history="1" r:id="rIdqvm030k8c7dbifajofodv">
         <w:r>
           <w:rPr>
             <w:rStyle w:val="Hyperlink"/>
@@ -5780,7 +6405,7 @@
       <w:pPr>
         <w:spacing w:after="100"/>
       </w:pPr>
-      <w:hyperlink w:history="1" r:id="rIdfru7usxka73clykzzt4xb">
+      <w:hyperlink w:history="1" r:id="rIdnzjra3h9-bfbmkhdaephw">
         <w:r>
           <w:rPr>
             <w:rStyle w:val="Hyperlink"/>
@@ -5793,7 +6418,7 @@
       <w:pPr>
         <w:spacing w:after="100"/>
       </w:pPr>
-      <w:hyperlink w:history="1" r:id="rIdtkknk7r8lrae-m74hjdg-">
+      <w:hyperlink w:history="1" r:id="rIdwbhww7mfowsyyye-ablh8">
         <w:r>
           <w:rPr>
             <w:rStyle w:val="Hyperlink"/>
@@ -5806,7 +6431,7 @@
       <w:pPr>
         <w:spacing w:after="100"/>
       </w:pPr>
-      <w:hyperlink w:history="1" r:id="rIdjnioibipvn2a4yhxjpkpk">
+      <w:hyperlink w:history="1" r:id="rIdr47dkaost0guiffdezcqj">
         <w:r>
           <w:rPr>
             <w:rStyle w:val="Hyperlink"/>
@@ -5819,7 +6444,7 @@
       <w:pPr>
         <w:spacing w:after="100"/>
       </w:pPr>
-      <w:hyperlink w:history="1" r:id="rIdww2uhqn7-1skgbm0mgdne">
+      <w:hyperlink w:history="1" r:id="rIdtzjuc-jknn5jrzdvftlae">
         <w:r>
           <w:rPr>
             <w:rStyle w:val="Hyperlink"/>
@@ -5832,7 +6457,7 @@
       <w:pPr>
         <w:spacing w:after="100"/>
       </w:pPr>
-      <w:hyperlink w:history="1" r:id="rIdz2yjw5pm2h40j2frztsde">
+      <w:hyperlink w:history="1" r:id="rIde0_nl4yywty3f2g_fxjyq">
         <w:r>
           <w:rPr>
             <w:rStyle w:val="Hyperlink"/>
@@ -5842,6 +6467,14 @@
       </w:hyperlink>
     </w:p>
     <w:p>
+      <w:pPr>
+        <w:spacing w:after="160"/>
+      </w:pPr>
+      <w:r>
+        <w:t xml:space="preserve">Acuerdo 1231 del 29 de agosto de 2018, Consejo Directivo, Corporación Universidad de la Costa CUC — "Por medio del cual se modifica el Acuerdo 1012 de 2017, el cual aprueba la creación y conformación del Comité de Ética" (documento institucional interno, aportado directamente por la universidad).</w:t>
+      </w:r>
+    </w:p>
+    <w:p>
       <w:r>
         <w:br w:type="page"/>
       </w:r>
@@ -5852,6 +6485,26 @@
       </w:pPr>
       <w:r>
         <w:t xml:space="preserve">Anexo A — Modelo de consentimiento informado (voluntarios adicionales)</w:t>
+      </w:r>
+    </w:p>
+    <w:p>
+      <w:pPr>
+        <w:spacing w:after="160"/>
+      </w:pPr>
+      <w:r>
+        <w:rPr>
+          <w:b/>
+          <w:bCs/>
+        </w:rPr>
+        <w:t xml:space="preserve">Versión: 1.0  —  Fecha de elaboración: 08 de julio de 2026</w:t>
+      </w:r>
+    </w:p>
+    <w:p>
+      <w:pPr>
+        <w:spacing w:after="160"/>
+      </w:pPr>
+      <w:r>
+        <w:t xml:space="preserve">(Campos exigidos por el Artículo 13.4 del Acuerdo 1231/2018 — actualizar la versión y fecha cada vez que se modifique este formato.)</w:t>
       </w:r>
     </w:p>
     <w:p>

</xml_diff>

<commit_message>
docs: marcar hoja de vida del investigador principal como completa
</commit_message>
<xml_diff>
--- a/docs/Protocolo_Investigacion_MVP_Voz_Gestos.docx
+++ b/docs/Protocolo_Investigacion_MVP_Voz_Gestos.docx
@@ -5011,7 +5011,7 @@
                 <w:sz w:val="20"/>
                 <w:szCs w:val="20"/>
               </w:rPr>
-              <w:t xml:space="preserve">PENDIENTE — falta adjuntar</w:t>
+              <w:t xml:space="preserve">Listo — Hoja_de_Vida_Wilmer_Perez_V4.docx, incluye soporte de idoneidad para esta investigación específica</w:t>
             </w:r>
           </w:p>
         </w:tc>
@@ -6366,7 +6366,7 @@
       <w:pPr>
         <w:spacing w:after="100"/>
       </w:pPr>
-      <w:hyperlink w:history="1" r:id="rIdjvjxfhlyhdpdfb06ygtan">
+      <w:hyperlink w:history="1" r:id="rIdhbaw6tibctqz4xzxxbcbw">
         <w:r>
           <w:rPr>
             <w:rStyle w:val="Hyperlink"/>
@@ -6379,7 +6379,7 @@
       <w:pPr>
         <w:spacing w:after="100"/>
       </w:pPr>
-      <w:hyperlink w:history="1" r:id="rIdhkruovm494v6fxe5gprtj">
+      <w:hyperlink w:history="1" r:id="rId-wqlfgbgh6nbmuh4cij0v">
         <w:r>
           <w:rPr>
             <w:rStyle w:val="Hyperlink"/>
@@ -6392,7 +6392,7 @@
       <w:pPr>
         <w:spacing w:after="100"/>
       </w:pPr>
-      <w:hyperlink w:history="1" r:id="rIdqvm030k8c7dbifajofodv">
+      <w:hyperlink w:history="1" r:id="rIdpaaiz0xe0ubnolo0hbrtx">
         <w:r>
           <w:rPr>
             <w:rStyle w:val="Hyperlink"/>
@@ -6405,7 +6405,7 @@
       <w:pPr>
         <w:spacing w:after="100"/>
       </w:pPr>
-      <w:hyperlink w:history="1" r:id="rIdnzjra3h9-bfbmkhdaephw">
+      <w:hyperlink w:history="1" r:id="rIdyilannejxkreezkdduxp3">
         <w:r>
           <w:rPr>
             <w:rStyle w:val="Hyperlink"/>
@@ -6418,7 +6418,7 @@
       <w:pPr>
         <w:spacing w:after="100"/>
       </w:pPr>
-      <w:hyperlink w:history="1" r:id="rIdwbhww7mfowsyyye-ablh8">
+      <w:hyperlink w:history="1" r:id="rIdul0bc9xxsg4z7iytqll2j">
         <w:r>
           <w:rPr>
             <w:rStyle w:val="Hyperlink"/>
@@ -6431,7 +6431,7 @@
       <w:pPr>
         <w:spacing w:after="100"/>
       </w:pPr>
-      <w:hyperlink w:history="1" r:id="rIdr47dkaost0guiffdezcqj">
+      <w:hyperlink w:history="1" r:id="rIdqyesxjhh4-amngbtsagac">
         <w:r>
           <w:rPr>
             <w:rStyle w:val="Hyperlink"/>
@@ -6444,7 +6444,7 @@
       <w:pPr>
         <w:spacing w:after="100"/>
       </w:pPr>
-      <w:hyperlink w:history="1" r:id="rIdtzjuc-jknn5jrzdvftlae">
+      <w:hyperlink w:history="1" r:id="rIdhk1mwidi5b6gjyx47dq8z">
         <w:r>
           <w:rPr>
             <w:rStyle w:val="Hyperlink"/>
@@ -6457,7 +6457,7 @@
       <w:pPr>
         <w:spacing w:after="100"/>
       </w:pPr>
-      <w:hyperlink w:history="1" r:id="rIde0_nl4yywty3f2g_fxjyq">
+      <w:hyperlink w:history="1" r:id="rIdasu54wuidn12bfb-x6gir">
         <w:r>
           <w:rPr>
             <w:rStyle w:val="Hyperlink"/>

</xml_diff>